<commit_message>
docs: finalize verified demos and academic release readiness
</commit_message>
<xml_diff>
--- a/deliverables/final-academic-submission/CityBrain_Final_Project_Report.docx
+++ b/deliverables/final-academic-submission/CityBrain_Final_Project_Report.docx
@@ -26,7 +26,7 @@
           <w:b/>
           <w:sz w:val="36"/>
         </w:rPr>
-        <w:t>AI-Assisted Emergency Response Coordination</w:t>
+        <w:t>AI-Based Emergency Response Coordination</w:t>
       </w:r>
     </w:p>
     <w:p>
@@ -281,7 +281,7 @@
       <w:r>
         <w:t>14. Failure Handling and Validation</w:t>
         <w:tab/>
-        <w:t>7</w:t>
+        <w:t>8</w:t>
       </w:r>
     </w:p>
     <w:p>
@@ -337,7 +337,7 @@
       <w:r>
         <w:t>18. Conclusion</w:t>
         <w:tab/>
-        <w:t>8</w:t>
+        <w:t>9</w:t>
       </w:r>
     </w:p>
     <w:p>
@@ -365,7 +365,7 @@
       <w:r>
         <w:t>20. Appendix: Reproduction and Demo Instructions</w:t>
         <w:tab/>
-        <w:t>9</w:t>
+        <w:t>10</w:t>
       </w:r>
     </w:p>
     <w:p>
@@ -612,6 +612,9 @@
       <w:r>
         <w:t>This guard is part of the integrated runtime behavior and is not the treatment tested by the V3.1 static-versus-dynamic legacy harness. That harness measures outcomes from its configured policy arms; it does not establish the isolated causal effect of the guard.</w:t>
       </w:r>
+      <w:r>
+        <w:t xml:space="preserve"> Separate dynamic evidence is the preserved synthetic S08 grid demo: P0/P1/P2 at 301/311/316 s and SUCCESS at 425 s. Each acceptance follows exact physical read-back. It is not the Chennai seed-17 run, not a test of its guard, and not an added research trial. The archive and verification command are documented in the final demo checklist.</w:t>
+      </w:r>
     </w:p>
     <w:p>
       <w:pPr>
@@ -689,12 +692,12 @@
         <w:jc w:val="center"/>
       </w:pPr>
       <w:r>
-        <w:t>Figure 2. Fresh capture from the local read-only replay at 704 simulated seconds. It is synthetic replay evidence; the dashboard’s visible legacy V3.0 prototype branding is preserved.</w:t>
+        <w:t>Figure 2. Fresh current-dashboard capture at 200 simulated seconds from a completed local synthetic replay. The recorded ambulance, accepted route, hospital markers and replay provenance are visible.</w:t>
       </w:r>
     </w:p>
     <w:p>
       <w:r>
-        <w:t>The screenshot is captured from the saved `/tmp/citybrain-v32-final-replay` output through local replay mode. It shows terminal SUCCESS, accepted route, hospitals, signal state and a synthetic sample overlay with stale/expired classification. At the terminal frame the ambulance telemetry fields display UNAVAILABLE; the image should not be interpreted as a live moving-vehicle frame. The report makes no claim of an active provider feed.</w:t>
+        <w:t>The image is a fresh capture of the final dashboard from the separately validated local seed-17 replay-assisted output. It shows an active recorded ambulance at t=200, not live traffic. At terminal SUCCESS (704 s), the dashboard removes the active vehicle and explicitly explains that the route is recorded history, with no current vehicle fix. No provider request was made.</w:t>
       </w:r>
     </w:p>
     <w:p>
@@ -2170,7 +2173,7 @@
     </w:p>
     <w:p>
       <w:r>
-        <w:t>Validation reported for the V3.1 implementation includes 447 passing pytest tests, ten passing compatibility scripts, fresh seed-17 simulation and replay-assisted smokes reaching SUCCESS at 704 simulation seconds, and browser replay checks with zero recorded page errors in the project report. The read-only historical validator found 2,172 of 2,172 manifest entries matching recorded size and hash. These are distinct evidence classes and none adds trials to the 60-cell V3.1 study [1].</w:t>
+        <w:t>Final QA independently reran the full suite: 447 pytest tests passed in 38.38 seconds, and all ten compatibility scripts passed. Fresh clean-provenance normal and replay-assisted seed-17 runs both reached SUCCESS at 704 s with zero route changes and zero telemetry/dashboard write failures. Chrome 155 checks passed with no page errors or failed local HTTP responses, covering geometry, movement, signals, guarded KEEP, closure/timestamp recovery, consented location emulation and 800/390 px layouts. All 2,172 historical entries and all 426 V3.1 study files were unchanged. These evidence classes do not add research trials [15].</w:t>
       </w:r>
     </w:p>
     <w:p>
@@ -2499,8 +2502,16 @@
     </w:p>
     <w:p>
       <w:r>
-        <w:t>Accessed 18 October 2026. The project documentation does not include a formal peer-reviewed literature review; references above identify the software/data contracts and internal evidence actually used.</w:t>
+        <w:t xml:space="preserve">[15] CityBrain, “Final Project Status” and compact final QA evidence, 18 Oct 2026. </w:t>
       </w:r>
+      <w:hyperlink r:id="rId27">
+        <w:r>
+          <w:rPr>
+            <w:color w:val="0563C1"/>
+          </w:rPr>
+          <w:t>https://github.com/arghsahai/CityBrain/blob/feature/citybrain-v3-roadmap/docs/FINAL_PROJECT_STATUS.md</w:t>
+        </w:r>
+      </w:hyperlink>
     </w:p>
     <w:p>
       <w:pPr>
@@ -2848,7 +2859,7 @@
                 <w:color w:val="1A2734"/>
                 <w:sz w:val="18"/>
               </w:rPr>
-              <w:t>./tools/run_chennai.sh --mode replay --events /tmp/citybrain-v32-final-replay --port 8773 --no-browser</w:t>
+              <w:t>./tools/run_chennai.sh --mode replay --events /path/to/completed-chennai-output --port 8773 --no-browser</w:t>
             </w:r>
           </w:p>
         </w:tc>
@@ -2883,12 +2894,12 @@
     </w:p>
     <w:p>
       <w:r>
-        <w:t>For a fresh, non-research headless smoke, use a unique /tmp output and the command in docs/V31_IMPLEMENTATION_REPORT.md. Do not run the 60-trial experiment or write into official result directories for a presentation. Open the printed local URL, inspect source/freshness labels, show the route and signal telemetry, and explain that REPLAY / SYNTHETIC_SAMPLE means offline sample data. If Cesium fails, use the 2D/SVG fallback. Stop an interactive launcher with Ctrl-C and wait for child cleanup.</w:t>
+        <w:t>For a fresh non-research smoke, use a unique temporary output and the supported launcher; never write into official result directories. For separate saved replanning evidence, run venv/bin/python tools/verify_saved_replan.py, then the safe extraction and read-only dashboard commands in FINAL_DEMO_CHECKLIST.md. The saved S08 archive checksum and execution-before-acceptance evidence are verified; original generated input hashes are recorded but cannot be recomputed because those input files are absent from the compact archive. Use Ctrl-C for shutdown.</w:t>
       </w:r>
     </w:p>
     <w:p>
       <w:r>
-        <w:t>Five-minute spoken path: (0:00) define the bounded problem and evidence boundary; (0:40) show the OSM-derived Chennai map and simulated traffic; (1:30) trace TraCI state through agents/planner and route read-back; (2:20) explain KEEP/REPLAN/NO_ROUTE and the 20-second soft-change guard; (3:00) show dashboard sources, signals and synthetic replay labels; (3:40) report the three scenario outcome rows and matched S05 comparison; (4:30) close with provider, hospital, signal and production limitations.</w:t>
+        <w:t>Five-minute final walkthrough: (0:00–0:40) problem and architecture; (0:40–1:40) Demo A, Chennai map, dispatch, recorded motion and KEEP; (1:40–2:40) explicitly switch to separate saved S08 grid Demo B, P0/P1/P2 and SUCCESS; (2:40–3:20) source/freshness, signals and SVG fallback; (3:20–4:20) formal study outcomes and matched-pair limits; (4:20–5:00) external-data, clinical and production limitations. The final demo checklist also supplies a two-minute fallback and exact safe extraction/viewer commands.</w:t>
       </w:r>
     </w:p>
     <w:sectPr>

</xml_diff>